<commit_message>
Inclui a célula alternativa (TODO 0) no material do aluno
</commit_message>
<xml_diff>
--- a/material/Material_Aluno_Colab_Dados.docx
+++ b/material/Material_Aluno_Colab_Dados.docx
@@ -398,7 +398,7 @@
               <w:rPr>
                 <w:sz w:val="19"/>
               </w:rPr>
-              <w:t>📌 Este material acompanha o notebook Aula_Prática_Colab_Dados_Aluno.ipynb. Execute as etapas na mesma ordem.</w:t>
+              <w:t>📌 Este material acompanha o notebook Aula_Pratica_Colab_Dados_Aluno.ipynb. Execute as etapas na mesma ordem.</w:t>
             </w:r>
           </w:p>
         </w:tc>
@@ -883,6 +883,164 @@
                 <w:sz w:val="19"/>
               </w:rPr>
               <w:t>⚠️ O Colab não mantém os arquivos para sempre. Ao encerrar a sessão, pode ser necessário enviá-los novamente.</w:t>
+            </w:r>
+          </w:p>
+        </w:tc>
+      </w:tr>
+    </w:tbl>
+    <w:p>
+      <w:pPr>
+        <w:pStyle w:val="Heading2"/>
+      </w:pPr>
+      <w:r>
+        <w:t>Alternativa: buscar os arquivos direto do GitHub</w:t>
+      </w:r>
+    </w:p>
+    <w:p>
+      <w:r>
+        <w:t>Use esta célula somente se o upload não funcionar ou se você não tiver os arquivos no computador. Antes de executar, complete a lista com os nomes dos sete arquivos da tabela “Arquivos necessários”. Cada nome vai entre aspas, e os nomes são separados por vírgula.</w:t>
+      </w:r>
+    </w:p>
+    <w:tbl>
+      <w:tblPr>
+        <w:tblW w:type="auto" w:w="0"/>
+        <w:jc w:val="center"/>
+        <w:tblLook w:firstColumn="1" w:firstRow="1" w:lastColumn="0" w:lastRow="0" w:noHBand="0" w:noVBand="1" w:val="04A0"/>
+      </w:tblPr>
+      <w:tblGrid>
+        <w:gridCol w:w="10166"/>
+      </w:tblGrid>
+      <w:tr>
+        <w:tc>
+          <w:tcPr>
+            <w:tcW w:type="dxa" w:w="10166"/>
+            <w:shd w:fill="F3F4F6"/>
+            <w:tcBorders>
+              <w:top w:val="single" w:sz="4" w:color="D1D5DB"/>
+              <w:left w:val="single" w:sz="4" w:color="D1D5DB"/>
+              <w:bottom w:val="single" w:sz="4" w:color="D1D5DB"/>
+              <w:right w:val="single" w:sz="4" w:color="D1D5DB"/>
+            </w:tcBorders>
+          </w:tcPr>
+          <w:p>
+            <w:pPr>
+              <w:pStyle w:val="CodeBlock"/>
+            </w:pPr>
+            <w:r>
+              <w:t>import urllib.request</w:t>
+            </w:r>
+            <w:r>
+              <w:br/>
+            </w:r>
+            <w:r/>
+            <w:r>
+              <w:br/>
+            </w:r>
+            <w:r>
+              <w:t>origem = ("https://raw.githubusercontent.com/iasenai1111-ux/"</w:t>
+            </w:r>
+            <w:r>
+              <w:br/>
+            </w:r>
+            <w:r>
+              <w:t xml:space="preserve">          "python-colab-manipulacao-dados/main/dados/")</w:t>
+            </w:r>
+            <w:r>
+              <w:br/>
+            </w:r>
+            <w:r/>
+            <w:r>
+              <w:br/>
+            </w:r>
+            <w:r>
+              <w:t># TODO 0 (opcional): complete a lista com os sete nomes de arquivo</w:t>
+            </w:r>
+            <w:r>
+              <w:br/>
+            </w:r>
+            <w:r>
+              <w:t>arquivos = ['dia01.xlsx', '__________', '__________', '__________',</w:t>
+            </w:r>
+            <w:r>
+              <w:br/>
+            </w:r>
+            <w:r>
+              <w:t xml:space="preserve">            '__________', '__________', '__________']</w:t>
+            </w:r>
+            <w:r>
+              <w:br/>
+            </w:r>
+            <w:r/>
+            <w:r>
+              <w:br/>
+            </w:r>
+            <w:r>
+              <w:t>for nome in arquivos:</w:t>
+            </w:r>
+            <w:r>
+              <w:br/>
+            </w:r>
+            <w:r>
+              <w:t xml:space="preserve">    try:</w:t>
+            </w:r>
+            <w:r>
+              <w:br/>
+            </w:r>
+            <w:r>
+              <w:t xml:space="preserve">        urllib.request.urlretrieve(origem + nome, nome)</w:t>
+            </w:r>
+            <w:r>
+              <w:br/>
+            </w:r>
+            <w:r>
+              <w:t xml:space="preserve">        print("OK  -", nome)</w:t>
+            </w:r>
+            <w:r>
+              <w:br/>
+            </w:r>
+            <w:r>
+              <w:t xml:space="preserve">    except Exception:</w:t>
+            </w:r>
+            <w:r>
+              <w:br/>
+            </w:r>
+            <w:r>
+              <w:t xml:space="preserve">        print("ERRO -", nome)</w:t>
+            </w:r>
+          </w:p>
+        </w:tc>
+      </w:tr>
+    </w:tbl>
+    <w:tbl>
+      <w:tblPr>
+        <w:tblW w:type="auto" w:w="0"/>
+        <w:jc w:val="center"/>
+        <w:tblLook w:firstColumn="1" w:firstRow="1" w:lastColumn="0" w:lastRow="0" w:noHBand="0" w:noVBand="1" w:val="04A0"/>
+      </w:tblPr>
+      <w:tblGrid>
+        <w:gridCol w:w="10166"/>
+      </w:tblGrid>
+      <w:tr>
+        <w:tc>
+          <w:tcPr>
+            <w:tcW w:type="dxa" w:w="10166"/>
+            <w:shd w:fill="FFF6D8"/>
+            <w:tcBorders>
+              <w:top w:val="single" w:sz="6" w:color="C58B00"/>
+              <w:left w:val="single" w:sz="6" w:color="C58B00"/>
+              <w:bottom w:val="single" w:sz="6" w:color="C58B00"/>
+              <w:right w:val="single" w:sz="6" w:color="C58B00"/>
+            </w:tcBorders>
+          </w:tcPr>
+          <w:p>
+            <w:pPr>
+              <w:spacing w:after="0"/>
+            </w:pPr>
+            <w:r>
+              <w:rPr>
+                <w:sz w:val="19"/>
+              </w:rPr>
+              <w:t>Dica: se aparecer ERRO ao lado de um nome, confira se ele está escrito exatamente como na tabela de arquivos, incluindo a extensão.</w:t>
             </w:r>
           </w:p>
         </w:tc>

</xml_diff>

<commit_message>
Endereço da pasta de dados vira lacuna no material do aluno
</commit_message>
<xml_diff>
--- a/material/Material_Aluno_Colab_Dados.docx
+++ b/material/Material_Aluno_Colab_Dados.docx
@@ -898,9 +898,44 @@
     </w:p>
     <w:p>
       <w:r>
-        <w:t>Use esta célula somente se o upload não funcionar ou se você não tiver os arquivos no computador. Antes de executar, complete a lista com os nomes dos sete arquivos da tabela “Arquivos necessários”. Cada nome vai entre aspas, e os nomes são separados por vírgula.</w:t>
+        <w:t>Use esta célula somente se o upload não funcionar ou se você não tiver os arquivos no computador. Antes de executar, complete duas lacunas: o endereço da pasta de dados (copie do quadro abaixo, entre aspas) e a lista com os nomes dos sete arquivos da tabela “Arquivos necessários”, cada um entre aspas e separados por vírgula.</w:t>
       </w:r>
     </w:p>
+    <w:tbl>
+      <w:tblPr>
+        <w:tblW w:type="auto" w:w="0"/>
+        <w:jc w:val="center"/>
+        <w:tblLook w:firstColumn="1" w:firstRow="1" w:lastColumn="0" w:lastRow="0" w:noHBand="0" w:noVBand="1" w:val="04A0"/>
+      </w:tblPr>
+      <w:tblGrid>
+        <w:gridCol w:w="10166"/>
+      </w:tblGrid>
+      <w:tr>
+        <w:tc>
+          <w:tcPr>
+            <w:tcW w:type="dxa" w:w="10166"/>
+            <w:shd w:fill="FFF6D8"/>
+            <w:tcBorders>
+              <w:top w:val="single" w:sz="6" w:color="C58B00"/>
+              <w:left w:val="single" w:sz="6" w:color="C58B00"/>
+              <w:bottom w:val="single" w:sz="6" w:color="C58B00"/>
+              <w:right w:val="single" w:sz="6" w:color="C58B00"/>
+            </w:tcBorders>
+          </w:tcPr>
+          <w:p>
+            <w:pPr>
+              <w:spacing w:after="0"/>
+            </w:pPr>
+            <w:r>
+              <w:rPr>
+                <w:sz w:val="19"/>
+              </w:rPr>
+              <w:t>Endereço da pasta de dados: https://raw.githubusercontent.com/iasenai1111-ux/python-colab-manipulacao-dados/main/dados/</w:t>
+            </w:r>
+          </w:p>
+        </w:tc>
+      </w:tr>
+    </w:tbl>
     <w:tbl>
       <w:tblPr>
         <w:tblW w:type="auto" w:w="0"/>
@@ -937,13 +972,13 @@
               <w:br/>
             </w:r>
             <w:r>
-              <w:t>origem = ("https://raw.githubusercontent.com/iasenai1111-ux/"</w:t>
+              <w:t># TODO 0 (opcional): copie o endereço da pasta de dados</w:t>
             </w:r>
             <w:r>
               <w:br/>
             </w:r>
             <w:r>
-              <w:t xml:space="preserve">          "python-colab-manipulacao-dados/main/dados/")</w:t>
+              <w:t>origem = "______________________________"</w:t>
             </w:r>
             <w:r>
               <w:br/>
@@ -987,7 +1022,7 @@
               <w:br/>
             </w:r>
             <w:r>
-              <w:t xml:space="preserve">        urllib.request.urlretrieve(origem + nome, nome)</w:t>
+              <w:t xml:space="preserve">        urllib.request.urlretrieve(origem.rstrip("/") + "/" + nome, nome)</w:t>
             </w:r>
             <w:r>
               <w:br/>
@@ -1040,7 +1075,7 @@
               <w:rPr>
                 <w:sz w:val="19"/>
               </w:rPr>
-              <w:t>Dica: se aparecer ERRO ao lado de um nome, confira se ele está escrito exatamente como na tabela de arquivos, incluindo a extensão.</w:t>
+              <w:t>Dica: se aparecer ERRO em todos os arquivos, o problema está no endereço; se aparecer em um só, está no nome daquele arquivo. Confira letra por letra, incluindo a extensão.</w:t>
             </w:r>
           </w:p>
         </w:tc>

</xml_diff>